<commit_message>
feat: implement real-world application verification engine and phase gate (goal.md)
</commit_message>
<xml_diff>
--- a/resumes/generated/Oracle_India_Lead_OCI_Architect_20260922.docx
+++ b/resumes/generated/Oracle_India_Lead_OCI_Architect_20260922.docx
@@ -68,7 +68,7 @@
           <w:rFonts w:ascii="Calibri" w:hAnsi="Calibri"/>
           <w:sz w:val="20"/>
         </w:rPr>
-        <w:t>Principal Cloud Engineer with 12.0+ years of enterprise IT experience, including 6.5+ years specializing in Oracle Cloud Infrastructure (OCI) with proven expertise in GenAI platform engineering (RAG, Model Context Protocol, ChatOps), production Kubernetes (OKE) platform architecture, multi-cloud networking &amp; landing zone governance. Proven track record architecting mission-critical, telecom-grade cloud environments, Infrastructure as Code (Terraform), and AI-driven operations. Recognized for bridging architecture, security, automation, and business outcomes.</w:t>
+        <w:t>Principal Cloud Engineer with 12.0+ years of enterprise IT experience, including 6.5+ years specializing in Oracle Cloud Infrastructure (OCI) with proven expertise in production Kubernetes (OKE) platform architecture, enterprise IAM federation and air-gapped security boundaries. Proven track record architecting mission-critical, telecom-grade cloud environments, Infrastructure as Code (Terraform), and AI-driven operations. Recognized for bridging architecture, security, automation, and business outcomes.</w:t>
       </w:r>
     </w:p>
     <w:p>
@@ -121,6 +121,32 @@
           <w:rFonts w:ascii="Calibri" w:hAnsi="Calibri"/>
           <w:sz w:val="19"/>
         </w:rPr>
+        <w:t>Databases: Oracle DB 19c/12c RAC, Exadata, Autonomous Database (ADW/ADB)</w:t>
+      </w:r>
+    </w:p>
+    <w:p>
+      <w:pPr>
+        <w:pStyle w:val="ListBullet"/>
+        <w:spacing w:after="40"/>
+      </w:pPr>
+      <w:r>
+        <w:rPr>
+          <w:rFonts w:ascii="Calibri" w:hAnsi="Calibri"/>
+          <w:sz w:val="19"/>
+        </w:rPr>
+        <w:t>IaC &amp; Automation: Terraform, Ansible, OCI CLI, Bash</w:t>
+      </w:r>
+    </w:p>
+    <w:p>
+      <w:pPr>
+        <w:pStyle w:val="ListBullet"/>
+        <w:spacing w:after="40"/>
+      </w:pPr>
+      <w:r>
+        <w:rPr>
+          <w:rFonts w:ascii="Calibri" w:hAnsi="Calibri"/>
+          <w:sz w:val="19"/>
+        </w:rPr>
         <w:t>AI &amp; GenAI CloudOps: LangChain, LangGraph, Local LLMs, Agentic Frameworks, MCP Servers</w:t>
       </w:r>
     </w:p>
@@ -135,32 +161,6 @@
           <w:sz w:val="19"/>
         </w:rPr>
         <w:t>Security &amp; IAM: OCI IAM, Azure AD, SAML 2.0 / SSO, PAM Hardening, RBAC</w:t>
-      </w:r>
-    </w:p>
-    <w:p>
-      <w:pPr>
-        <w:pStyle w:val="ListBullet"/>
-        <w:spacing w:after="40"/>
-      </w:pPr>
-      <w:r>
-        <w:rPr>
-          <w:rFonts w:ascii="Calibri" w:hAnsi="Calibri"/>
-          <w:sz w:val="19"/>
-        </w:rPr>
-        <w:t>DevOps / CI-CD: OCI DevOps, Git, GitHub Actions, CI/CD Pipelines</w:t>
-      </w:r>
-    </w:p>
-    <w:p>
-      <w:pPr>
-        <w:pStyle w:val="ListBullet"/>
-        <w:spacing w:after="40"/>
-      </w:pPr>
-      <w:r>
-        <w:rPr>
-          <w:rFonts w:ascii="Calibri" w:hAnsi="Calibri"/>
-          <w:sz w:val="19"/>
-        </w:rPr>
-        <w:t>IaC &amp; Automation: Terraform, Ansible, OCI CLI, Bash</w:t>
       </w:r>
     </w:p>
     <w:p>
@@ -199,7 +199,7 @@
           <w:rFonts w:ascii="Calibri" w:hAnsi="Calibri"/>
           <w:sz w:val="19"/>
         </w:rPr>
-        <w:t>Databases: Oracle DB 19c/12c RAC, Exadata, Autonomous Database (ADW/ADB)</w:t>
+        <w:t>DevOps / CI-CD: OCI DevOps, Git, GitHub Actions, CI/CD Pipelines</w:t>
       </w:r>
     </w:p>
     <w:p>

</xml_diff>